<commit_message>
feat: dynamic Events page IG integration and WhatsOn section cleanup
</commit_message>
<xml_diff>
--- a/PADDOCK.docx
+++ b/PADDOCK.docx
@@ -103,15 +103,7 @@
         <w:t>something</w:t>
       </w:r>
       <w:r>
-        <w:t xml:space="preserve"> called: WHY </w:t>
-      </w:r>
-      <w:proofErr w:type="gramStart"/>
-      <w:r>
-        <w:t>PADDOCK,…</w:t>
-      </w:r>
-      <w:proofErr w:type="gramEnd"/>
-      <w:r>
-        <w:t>.)</w:t>
+        <w:t xml:space="preserve"> called: WHY PADDOCK,….)</w:t>
       </w:r>
     </w:p>
     <w:p>
@@ -192,15 +184,7 @@
         <w:jc w:val="both"/>
       </w:pPr>
       <w:r>
-        <w:t xml:space="preserve">The dead </w:t>
-      </w:r>
-      <w:proofErr w:type="gramStart"/>
-      <w:r>
-        <w:t>rabbit( Bar</w:t>
-      </w:r>
-      <w:proofErr w:type="gramEnd"/>
-      <w:r>
-        <w:t xml:space="preserve"> in New York):</w:t>
+        <w:t>The dead rabbit( Bar in New York):</w:t>
       </w:r>
     </w:p>
     <w:p>
@@ -269,15 +253,7 @@
         <w:jc w:val="both"/>
       </w:pPr>
       <w:r>
-        <w:t xml:space="preserve">Another section of “what’s on the dead </w:t>
-      </w:r>
-      <w:proofErr w:type="gramStart"/>
-      <w:r>
-        <w:t>rabbit”=</w:t>
-      </w:r>
-      <w:proofErr w:type="gramEnd"/>
-      <w:r>
-        <w:t xml:space="preserve"> what’s on </w:t>
+        <w:t xml:space="preserve">Another section of “what’s on the dead rabbit”= what’s on </w:t>
       </w:r>
       <w:r>
         <w:t xml:space="preserve">the </w:t>
@@ -377,6 +353,9 @@
         <w:t xml:space="preserve"> we want to analyze:</w:t>
       </w:r>
       <w:r>
+        <w:rPr>
+          <w:noProof/>
+        </w:rPr>
         <w:drawing>
           <wp:inline distT="0" distB="0" distL="0" distR="0" wp14:anchorId="7893DDBB" wp14:editId="1335B16E">
             <wp:extent cx="4099560" cy="1949043"/>
@@ -549,17 +528,12 @@
         </w:numPr>
       </w:pPr>
       <w:r>
-        <w:t xml:space="preserve">The section attached is the one with the </w:t>
-      </w:r>
-      <w:proofErr w:type="gramStart"/>
-      <w:r>
-        <w:t>pictures  to</w:t>
-      </w:r>
-      <w:proofErr w:type="gramEnd"/>
-      <w:r>
-        <w:t xml:space="preserve"> analyze on the website: </w:t>
-      </w:r>
-      <w:r>
+        <w:t xml:space="preserve">The section attached is the one with the pictures  to analyze on the website: </w:t>
+      </w:r>
+      <w:r>
+        <w:rPr>
+          <w:noProof/>
+        </w:rPr>
         <w:drawing>
           <wp:inline distT="0" distB="0" distL="0" distR="0" wp14:anchorId="5CAE9821" wp14:editId="0B3E0183">
             <wp:extent cx="5318760" cy="1260933"/>
@@ -712,6 +686,9 @@
         <w:t>:</w:t>
       </w:r>
       <w:r>
+        <w:rPr>
+          <w:noProof/>
+        </w:rPr>
         <w:drawing>
           <wp:inline distT="0" distB="0" distL="0" distR="0" wp14:anchorId="42C85867" wp14:editId="0A072F96">
             <wp:extent cx="4587240" cy="1692770"/>
@@ -770,23 +747,7 @@
         <w:t>,</w:t>
       </w:r>
       <w:r>
-        <w:t xml:space="preserve"> for example: Want to experience Kigali night in Rwanda, Paddock got </w:t>
-      </w:r>
-      <w:proofErr w:type="gramStart"/>
-      <w:r>
-        <w:t>u,…</w:t>
-      </w:r>
-      <w:proofErr w:type="gramEnd"/>
-      <w:r>
-        <w:t xml:space="preserve">… This is an </w:t>
-      </w:r>
-      <w:proofErr w:type="gramStart"/>
-      <w:r>
-        <w:t>Idea</w:t>
-      </w:r>
-      <w:proofErr w:type="gramEnd"/>
-      <w:r>
-        <w:t xml:space="preserve"> to modify and work on </w:t>
+        <w:t xml:space="preserve"> for example: Want to experience Kigali night in Rwanda, Paddock got u,…… This is an Idea to modify and work on </w:t>
       </w:r>
       <w:r>
         <w:t xml:space="preserve">to make </w:t>
@@ -966,15 +927,7 @@
         <w:t>designed</w:t>
       </w:r>
       <w:r>
-        <w:t xml:space="preserve"> our best </w:t>
-      </w:r>
-      <w:proofErr w:type="gramStart"/>
-      <w:r>
-        <w:t>top rated</w:t>
-      </w:r>
-      <w:proofErr w:type="gramEnd"/>
-      <w:r>
-        <w:t xml:space="preserve"> meu on the world.</w:t>
+        <w:t xml:space="preserve"> our best top rated meu on the world.</w:t>
       </w:r>
     </w:p>
     <w:p>
@@ -1216,23 +1169,7 @@
         <w:t>If</w:t>
       </w:r>
       <w:r>
-        <w:t xml:space="preserve"> these days are special events to happen, we have to design like an announcement line saying that: That …</w:t>
-      </w:r>
-      <w:proofErr w:type="gramStart"/>
-      <w:r>
-        <w:t>…..</w:t>
-      </w:r>
-      <w:proofErr w:type="gramEnd"/>
-      <w:r>
-        <w:t xml:space="preserve">something big event </w:t>
-      </w:r>
-      <w:proofErr w:type="gramStart"/>
-      <w:r>
-        <w:t>…..</w:t>
-      </w:r>
-      <w:proofErr w:type="gramEnd"/>
-      <w:r>
-        <w:t>is happening.</w:t>
+        <w:t xml:space="preserve"> these days are special events to happen, we have to design like an announcement line saying that: That ……..something big event …..is happening.</w:t>
       </w:r>
     </w:p>
     <w:p>
@@ -1384,15 +1321,7 @@
         </w:tabs>
       </w:pPr>
       <w:r>
-        <w:t xml:space="preserve">Free snacks (chips, </w:t>
-      </w:r>
-      <w:proofErr w:type="gramStart"/>
-      <w:r>
-        <w:t>groundnuts,…</w:t>
-      </w:r>
-      <w:proofErr w:type="gramEnd"/>
-      <w:r>
-        <w:t>)</w:t>
+        <w:t>Free snacks (chips, groundnuts,…)</w:t>
       </w:r>
     </w:p>
     <w:p>
@@ -1407,15 +1336,7 @@
         </w:tabs>
       </w:pPr>
       <w:r>
-        <w:t xml:space="preserve">Early booking </w:t>
-      </w:r>
-      <w:proofErr w:type="gramStart"/>
-      <w:r>
-        <w:t>( Advance</w:t>
-      </w:r>
-      <w:proofErr w:type="gramEnd"/>
-      <w:r>
-        <w:t xml:space="preserve"> payment and discount to be provided)</w:t>
+        <w:t>Early booking ( Advance payment and discount to be provided)</w:t>
       </w:r>
     </w:p>
     <w:p>
@@ -1591,7 +1512,7 @@
           <w:noProof/>
         </w:rPr>
         <w:drawing>
-          <wp:inline distT="0" distB="0" distL="0" distR="0" wp14:anchorId="78C8BCD6" wp14:editId="7299B823">
+          <wp:inline distT="0" distB="0" distL="0" distR="0" wp14:anchorId="78C8BCD6" wp14:editId="68AAE37F">
             <wp:extent cx="5943600" cy="2743200"/>
             <wp:effectExtent l="0" t="0" r="0" b="0"/>
             <wp:docPr id="1628762020" name="Picture 4"/>
@@ -1696,7 +1617,7 @@
       </w:pPr>
       <w:r>
         <w:pict w14:anchorId="145BC6DF">
-          <v:rect id="_x0000_i1129" style="width:0;height:1.5pt" o:hralign="center" o:hrstd="t" o:hr="t" fillcolor="#a0a0a0" stroked="f"/>
+          <v:rect id="_x0000_i1025" style="width:0;height:1.5pt" o:hralign="center" o:hrstd="t" o:hr="t" fillcolor="#a0a0a0" stroked="f"/>
         </w:pict>
       </w:r>
     </w:p>
@@ -1799,7 +1720,7 @@
       <w:r>
         <w:lastRenderedPageBreak/>
         <w:pict w14:anchorId="1FE91FF9">
-          <v:rect id="_x0000_i1130" style="width:0;height:1.5pt" o:hralign="center" o:hrstd="t" o:hr="t" fillcolor="#a0a0a0" stroked="f"/>
+          <v:rect id="_x0000_i1026" style="width:0;height:1.5pt" o:hralign="center" o:hrstd="t" o:hr="t" fillcolor="#a0a0a0" stroked="f"/>
         </w:pict>
       </w:r>
     </w:p>
@@ -1959,7 +1880,7 @@
       </w:pPr>
       <w:r>
         <w:pict w14:anchorId="4D7C5E76">
-          <v:rect id="_x0000_i1131" style="width:0;height:1.5pt" o:hralign="center" o:hrstd="t" o:hr="t" fillcolor="#a0a0a0" stroked="f"/>
+          <v:rect id="_x0000_i1027" style="width:0;height:1.5pt" o:hralign="center" o:hrstd="t" o:hr="t" fillcolor="#a0a0a0" stroked="f"/>
         </w:pict>
       </w:r>
     </w:p>
@@ -2052,7 +1973,7 @@
       </w:pPr>
       <w:r>
         <w:pict w14:anchorId="3740A7E3">
-          <v:rect id="_x0000_i1132" style="width:0;height:1.5pt" o:hralign="center" o:hrstd="t" o:hr="t" fillcolor="#a0a0a0" stroked="f"/>
+          <v:rect id="_x0000_i1028" style="width:0;height:1.5pt" o:hralign="center" o:hrstd="t" o:hr="t" fillcolor="#a0a0a0" stroked="f"/>
         </w:pict>
       </w:r>
     </w:p>
@@ -2161,7 +2082,7 @@
       </w:pPr>
       <w:r>
         <w:pict w14:anchorId="46759332">
-          <v:rect id="_x0000_i1133" style="width:0;height:1.5pt" o:hralign="center" o:hrstd="t" o:hr="t" fillcolor="#a0a0a0" stroked="f"/>
+          <v:rect id="_x0000_i1029" style="width:0;height:1.5pt" o:hralign="center" o:hrstd="t" o:hr="t" fillcolor="#a0a0a0" stroked="f"/>
         </w:pict>
       </w:r>
     </w:p>
@@ -2247,15 +2168,7 @@
         </w:tabs>
       </w:pPr>
       <w:r>
-        <w:t xml:space="preserve">“What’s On” section → adapt as “What’s </w:t>
-      </w:r>
-      <w:proofErr w:type="gramStart"/>
-      <w:r>
-        <w:t>On</w:t>
-      </w:r>
-      <w:proofErr w:type="gramEnd"/>
-      <w:r>
-        <w:t xml:space="preserve"> at Paddock”</w:t>
+        <w:t>“What’s On” section → adapt as “What’s On at Paddock”</w:t>
       </w:r>
     </w:p>
     <w:p>
@@ -2392,7 +2305,7 @@
       </w:pPr>
       <w:r>
         <w:pict w14:anchorId="279CB5F0">
-          <v:rect id="_x0000_i1134" style="width:0;height:1.5pt" o:hralign="center" o:hrstd="t" o:hr="t" fillcolor="#a0a0a0" stroked="f"/>
+          <v:rect id="_x0000_i1030" style="width:0;height:1.5pt" o:hralign="center" o:hrstd="t" o:hr="t" fillcolor="#a0a0a0" stroked="f"/>
         </w:pict>
       </w:r>
     </w:p>
@@ -2524,7 +2437,7 @@
       </w:pPr>
       <w:r>
         <w:pict w14:anchorId="41FC8AAF">
-          <v:rect id="_x0000_i1135" style="width:0;height:1.5pt" o:hralign="center" o:hrstd="t" o:hr="t" fillcolor="#a0a0a0" stroked="f"/>
+          <v:rect id="_x0000_i1031" style="width:0;height:1.5pt" o:hralign="center" o:hrstd="t" o:hr="t" fillcolor="#a0a0a0" stroked="f"/>
         </w:pict>
       </w:r>
     </w:p>
@@ -2597,7 +2510,7 @@
       </w:pPr>
       <w:r>
         <w:pict w14:anchorId="106134E4">
-          <v:rect id="_x0000_i1136" style="width:0;height:1.5pt" o:hralign="center" o:hrstd="t" o:hr="t" fillcolor="#a0a0a0" stroked="f"/>
+          <v:rect id="_x0000_i1032" style="width:0;height:1.5pt" o:hralign="center" o:hrstd="t" o:hr="t" fillcolor="#a0a0a0" stroked="f"/>
         </w:pict>
       </w:r>
     </w:p>
@@ -2711,7 +2624,7 @@
       </w:pPr>
       <w:r>
         <w:pict w14:anchorId="7C36D615">
-          <v:rect id="_x0000_i1137" style="width:0;height:1.5pt" o:hralign="center" o:hrstd="t" o:hr="t" fillcolor="#a0a0a0" stroked="f"/>
+          <v:rect id="_x0000_i1033" style="width:0;height:1.5pt" o:hralign="center" o:hrstd="t" o:hr="t" fillcolor="#a0a0a0" stroked="f"/>
         </w:pict>
       </w:r>
     </w:p>
@@ -2842,7 +2755,7 @@
       </w:pPr>
       <w:r>
         <w:pict w14:anchorId="5EBFD9DD">
-          <v:rect id="_x0000_i1138" style="width:0;height:1.5pt" o:hralign="center" o:hrstd="t" o:hr="t" fillcolor="#a0a0a0" stroked="f"/>
+          <v:rect id="_x0000_i1034" style="width:0;height:1.5pt" o:hralign="center" o:hrstd="t" o:hr="t" fillcolor="#a0a0a0" stroked="f"/>
         </w:pict>
       </w:r>
     </w:p>
@@ -2981,7 +2894,7 @@
       </w:pPr>
       <w:r>
         <w:pict w14:anchorId="0115E568">
-          <v:rect id="_x0000_i1139" style="width:0;height:1.5pt" o:hralign="center" o:hrstd="t" o:hr="t" fillcolor="#a0a0a0" stroked="f"/>
+          <v:rect id="_x0000_i1035" style="width:0;height:1.5pt" o:hralign="center" o:hrstd="t" o:hr="t" fillcolor="#a0a0a0" stroked="f"/>
         </w:pict>
       </w:r>
     </w:p>
@@ -3137,7 +3050,7 @@
       </w:pPr>
       <w:r>
         <w:pict w14:anchorId="400E6C65">
-          <v:rect id="_x0000_i1140" style="width:0;height:1.5pt" o:hralign="center" o:hrstd="t" o:hr="t" fillcolor="#a0a0a0" stroked="f"/>
+          <v:rect id="_x0000_i1036" style="width:0;height:1.5pt" o:hralign="center" o:hrstd="t" o:hr="t" fillcolor="#a0a0a0" stroked="f"/>
         </w:pict>
       </w:r>
     </w:p>
@@ -3237,7 +3150,7 @@
       </w:pPr>
       <w:r>
         <w:pict w14:anchorId="04613F94">
-          <v:rect id="_x0000_i1141" style="width:0;height:1.5pt" o:hralign="center" o:hrstd="t" o:hr="t" fillcolor="#a0a0a0" stroked="f"/>
+          <v:rect id="_x0000_i1037" style="width:0;height:1.5pt" o:hralign="center" o:hrstd="t" o:hr="t" fillcolor="#a0a0a0" stroked="f"/>
         </w:pict>
       </w:r>
     </w:p>
@@ -3324,7 +3237,7 @@
       </w:pPr>
       <w:r>
         <w:pict w14:anchorId="21D0CA63">
-          <v:rect id="_x0000_i1142" style="width:0;height:1.5pt" o:hralign="center" o:hrstd="t" o:hr="t" fillcolor="#a0a0a0" stroked="f"/>
+          <v:rect id="_x0000_i1038" style="width:0;height:1.5pt" o:hralign="center" o:hrstd="t" o:hr="t" fillcolor="#a0a0a0" stroked="f"/>
         </w:pict>
       </w:r>
     </w:p>
@@ -3438,7 +3351,7 @@
       </w:pPr>
       <w:r>
         <w:pict w14:anchorId="61F10597">
-          <v:rect id="_x0000_i1143" style="width:0;height:1.5pt" o:hralign="center" o:hrstd="t" o:hr="t" fillcolor="#a0a0a0" stroked="f"/>
+          <v:rect id="_x0000_i1039" style="width:0;height:1.5pt" o:hralign="center" o:hrstd="t" o:hr="t" fillcolor="#a0a0a0" stroked="f"/>
         </w:pict>
       </w:r>
     </w:p>
@@ -3530,7 +3443,7 @@
       </w:pPr>
       <w:r>
         <w:pict w14:anchorId="76705296">
-          <v:rect id="_x0000_i1144" style="width:0;height:1.5pt" o:hralign="center" o:hrstd="t" o:hr="t" fillcolor="#a0a0a0" stroked="f"/>
+          <v:rect id="_x0000_i1040" style="width:0;height:1.5pt" o:hralign="center" o:hrstd="t" o:hr="t" fillcolor="#a0a0a0" stroked="f"/>
         </w:pict>
       </w:r>
     </w:p>
@@ -3590,7 +3503,7 @@
       </w:pPr>
       <w:r>
         <w:pict w14:anchorId="35DFA1A3">
-          <v:rect id="_x0000_i1185" style="width:0;height:1.5pt" o:hralign="center" o:hrstd="t" o:hrnoshade="t" o:hr="t" fillcolor="gray" stroked="f"/>
+          <v:rect id="_x0000_i1041" style="width:0;height:1.5pt" o:hralign="center" o:hrstd="t" o:hrnoshade="t" o:hr="t" fillcolor="gray" stroked="f"/>
         </w:pict>
       </w:r>
     </w:p>
@@ -3742,7 +3655,7 @@
       </w:pPr>
       <w:r>
         <w:pict w14:anchorId="5F48A7E1">
-          <v:rect id="_x0000_i1186" style="width:0;height:1.5pt" o:hralign="center" o:hrstd="t" o:hrnoshade="t" o:hr="t" fillcolor="gray" stroked="f"/>
+          <v:rect id="_x0000_i1042" style="width:0;height:1.5pt" o:hralign="center" o:hrstd="t" o:hrnoshade="t" o:hr="t" fillcolor="gray" stroked="f"/>
         </w:pict>
       </w:r>
     </w:p>
@@ -3940,7 +3853,7 @@
       </w:pPr>
       <w:r>
         <w:pict w14:anchorId="015D4F63">
-          <v:rect id="_x0000_i1187" style="width:0;height:1.5pt" o:hralign="center" o:hrstd="t" o:hrnoshade="t" o:hr="t" fillcolor="gray" stroked="f"/>
+          <v:rect id="_x0000_i1043" style="width:0;height:1.5pt" o:hralign="center" o:hrstd="t" o:hrnoshade="t" o:hr="t" fillcolor="gray" stroked="f"/>
         </w:pict>
       </w:r>
     </w:p>
@@ -4252,7 +4165,7 @@
       </w:pPr>
       <w:r>
         <w:pict w14:anchorId="73BB4AF9">
-          <v:rect id="_x0000_i1188" style="width:0;height:1.5pt" o:hralign="center" o:hrstd="t" o:hrnoshade="t" o:hr="t" fillcolor="gray" stroked="f"/>
+          <v:rect id="_x0000_i1044" style="width:0;height:1.5pt" o:hralign="center" o:hrstd="t" o:hrnoshade="t" o:hr="t" fillcolor="gray" stroked="f"/>
         </w:pict>
       </w:r>
     </w:p>
@@ -4343,7 +4256,459 @@
         <w:t>Micro-interactions:</w:t>
       </w:r>
       <w:r>
-        <w:t xml:space="preserve"> Subtle animations, such as bubbles or condensation textures, to make the user "feel" the coldness of the drinks while browsing on their phone. </w:t>
+        <w:t xml:space="preserve"> Subtle animations, such as bubbles or condensation textures, to make the user "feel" the coldness of the drinks while browsing on their phone.</w:t>
+      </w:r>
+    </w:p>
+    <w:p>
+      <w:pPr>
+        <w:tabs>
+          <w:tab w:val="left" w:pos="1308"/>
+        </w:tabs>
+      </w:pPr>
+    </w:p>
+    <w:p>
+      <w:pPr>
+        <w:tabs>
+          <w:tab w:val="left" w:pos="1308"/>
+        </w:tabs>
+      </w:pPr>
+    </w:p>
+    <w:p>
+      <w:pPr>
+        <w:tabs>
+          <w:tab w:val="left" w:pos="1308"/>
+        </w:tabs>
+      </w:pPr>
+      <w:r>
+        <w:t xml:space="preserve">Using </w:t>
+      </w:r>
+      <w:r>
+        <w:rPr>
+          <w:b/>
+          <w:bCs/>
+        </w:rPr>
+        <w:t>Antigravity IDE</w:t>
+      </w:r>
+      <w:r>
+        <w:t xml:space="preserve"> alongside </w:t>
+      </w:r>
+      <w:r>
+        <w:rPr>
+          <w:b/>
+          <w:bCs/>
+        </w:rPr>
+        <w:t>Claude Code</w:t>
+      </w:r>
+      <w:r>
+        <w:t xml:space="preserve"> is the ultimate "power move" for an AI-native developer. Antigravity provides the high-fidelity visual workspace, while Claude Code acts as the terminal-based engine that executes your system-level changes. </w:t>
+      </w:r>
+    </w:p>
+    <w:p>
+      <w:pPr>
+        <w:tabs>
+          <w:tab w:val="left" w:pos="1308"/>
+        </w:tabs>
+      </w:pPr>
+      <w:r>
+        <w:t xml:space="preserve">Here is how to leverage this specific environment to build out the </w:t>
+      </w:r>
+      <w:r>
+        <w:rPr>
+          <w:b/>
+          <w:bCs/>
+        </w:rPr>
+        <w:t>PaddockV2.0</w:t>
+      </w:r>
+      <w:r>
+        <w:t xml:space="preserve"> "About" section:</w:t>
+      </w:r>
+    </w:p>
+    <w:p>
+      <w:pPr>
+        <w:tabs>
+          <w:tab w:val="left" w:pos="1308"/>
+        </w:tabs>
+        <w:rPr>
+          <w:b/>
+          <w:bCs/>
+        </w:rPr>
+      </w:pPr>
+      <w:r>
+        <w:rPr>
+          <w:b/>
+          <w:bCs/>
+        </w:rPr>
+        <w:t>1. The Antigravity + Claude Code Workflow</w:t>
+      </w:r>
+    </w:p>
+    <w:p>
+      <w:pPr>
+        <w:tabs>
+          <w:tab w:val="left" w:pos="1308"/>
+        </w:tabs>
+      </w:pPr>
+      <w:r>
+        <w:t>Since Antigravity is built for rapid AI iteration, you can use the dual-pane strategy:</w:t>
+      </w:r>
+    </w:p>
+    <w:p>
+      <w:pPr>
+        <w:numPr>
+          <w:ilvl w:val="0"/>
+          <w:numId w:val="31"/>
+        </w:numPr>
+        <w:tabs>
+          <w:tab w:val="left" w:pos="1308"/>
+        </w:tabs>
+      </w:pPr>
+      <w:r>
+        <w:rPr>
+          <w:b/>
+          <w:bCs/>
+        </w:rPr>
+        <w:t>Visual Side (Antigravity):</w:t>
+      </w:r>
+      <w:r>
+        <w:t xml:space="preserve"> Keep your </w:t>
+      </w:r>
+      <w:proofErr w:type="spellStart"/>
+      <w:r>
+        <w:t>ABOUT.tsx</w:t>
+      </w:r>
+      <w:proofErr w:type="spellEnd"/>
+      <w:r>
+        <w:t xml:space="preserve"> file open. You will see the code update in real-time as Claude Code works. </w:t>
+      </w:r>
+    </w:p>
+    <w:p>
+      <w:pPr>
+        <w:numPr>
+          <w:ilvl w:val="0"/>
+          <w:numId w:val="31"/>
+        </w:numPr>
+        <w:tabs>
+          <w:tab w:val="left" w:pos="1308"/>
+        </w:tabs>
+      </w:pPr>
+      <w:r>
+        <w:rPr>
+          <w:b/>
+          <w:bCs/>
+        </w:rPr>
+        <w:t>Terminal Side (Claude Code):</w:t>
+      </w:r>
+      <w:r>
+        <w:t xml:space="preserve"> Run your "Movie Credit" commands here. Claude will scan your project structure in Antigravity and apply the logic. </w:t>
+      </w:r>
+    </w:p>
+    <w:p>
+      <w:pPr>
+        <w:tabs>
+          <w:tab w:val="left" w:pos="1308"/>
+        </w:tabs>
+        <w:rPr>
+          <w:b/>
+          <w:bCs/>
+        </w:rPr>
+      </w:pPr>
+      <w:r>
+        <w:rPr>
+          <w:b/>
+          <w:bCs/>
+        </w:rPr>
+        <w:t>2. Implementing the "Movie Credit" About Section</w:t>
+      </w:r>
+    </w:p>
+    <w:p>
+      <w:pPr>
+        <w:tabs>
+          <w:tab w:val="left" w:pos="1308"/>
+        </w:tabs>
+      </w:pPr>
+      <w:r>
+        <w:t>Run this command in the Antigravity terminal to apply the vertical scrolling effect we designed:</w:t>
+      </w:r>
+    </w:p>
+    <w:p>
+      <w:pPr>
+        <w:tabs>
+          <w:tab w:val="left" w:pos="1308"/>
+        </w:tabs>
+      </w:pPr>
+      <w:proofErr w:type="spellStart"/>
+      <w:r>
+        <w:t>claude</w:t>
+      </w:r>
+      <w:proofErr w:type="spellEnd"/>
+      <w:r>
+        <w:t xml:space="preserve"> "In PaddockV2.0, build the About section. On the left, create a dark shadow-box. Use Framer Motion to animate the text 'Kigali’s Pulse. Reimagined.' and the brand story moving upward from a bottom divider line. Ensure the final line 'THIS IS PADDOCK' locks at the top."</w:t>
+      </w:r>
+    </w:p>
+    <w:p>
+      <w:pPr>
+        <w:tabs>
+          <w:tab w:val="left" w:pos="1308"/>
+        </w:tabs>
+        <w:rPr>
+          <w:b/>
+          <w:bCs/>
+        </w:rPr>
+      </w:pPr>
+      <w:r>
+        <w:rPr>
+          <w:b/>
+          <w:bCs/>
+        </w:rPr>
+        <w:t>3. Strategic "Antigravity" Enhancements</w:t>
+      </w:r>
+    </w:p>
+    <w:p>
+      <w:pPr>
+        <w:tabs>
+          <w:tab w:val="left" w:pos="1308"/>
+        </w:tabs>
+      </w:pPr>
+      <w:r>
+        <w:t>Because you are using a tool designed for rapid deployment, you should push the 10/10 standard further:</w:t>
+      </w:r>
+    </w:p>
+    <w:p>
+      <w:pPr>
+        <w:numPr>
+          <w:ilvl w:val="0"/>
+          <w:numId w:val="32"/>
+        </w:numPr>
+        <w:tabs>
+          <w:tab w:val="left" w:pos="1308"/>
+        </w:tabs>
+      </w:pPr>
+      <w:r>
+        <w:rPr>
+          <w:b/>
+          <w:bCs/>
+        </w:rPr>
+        <w:t>Responsive Preview:</w:t>
+      </w:r>
+      <w:r>
+        <w:t xml:space="preserve"> Use Antigravity’s built-in preview to check the "Movie Credit" scroll on mobile. If the text is too fast, tell Claude: </w:t>
+      </w:r>
+      <w:r>
+        <w:rPr>
+          <w:i/>
+          <w:iCs/>
+        </w:rPr>
+        <w:t>"Adjust the transition duration to 8 seconds for better readability on small screens"</w:t>
+      </w:r>
+      <w:r>
+        <w:t xml:space="preserve">. </w:t>
+      </w:r>
+    </w:p>
+    <w:p>
+      <w:pPr>
+        <w:numPr>
+          <w:ilvl w:val="0"/>
+          <w:numId w:val="32"/>
+        </w:numPr>
+        <w:tabs>
+          <w:tab w:val="left" w:pos="1308"/>
+        </w:tabs>
+      </w:pPr>
+      <w:proofErr w:type="spellStart"/>
+      <w:r>
+        <w:rPr>
+          <w:b/>
+          <w:bCs/>
+        </w:rPr>
+        <w:t>Glassmorphism</w:t>
+      </w:r>
+      <w:proofErr w:type="spellEnd"/>
+      <w:r>
+        <w:rPr>
+          <w:b/>
+          <w:bCs/>
+        </w:rPr>
+        <w:t xml:space="preserve"> Polish:</w:t>
+      </w:r>
+      <w:r>
+        <w:t xml:space="preserve"> Use the Antigravity inspector to find the exact hex codes for your background bottles. Then, tell Claude: </w:t>
+      </w:r>
+      <w:r>
+        <w:rPr>
+          <w:i/>
+          <w:iCs/>
+        </w:rPr>
+        <w:t>"Apply a backdrop-blur-xl and a border-white/10 to the About container to make the scrolling text pop against the bottles"</w:t>
+      </w:r>
+      <w:r>
+        <w:t xml:space="preserve">. </w:t>
+      </w:r>
+    </w:p>
+    <w:p>
+      <w:pPr>
+        <w:numPr>
+          <w:ilvl w:val="0"/>
+          <w:numId w:val="32"/>
+        </w:numPr>
+        <w:tabs>
+          <w:tab w:val="left" w:pos="1308"/>
+        </w:tabs>
+      </w:pPr>
+      <w:r>
+        <w:rPr>
+          <w:b/>
+          <w:bCs/>
+        </w:rPr>
+        <w:lastRenderedPageBreak/>
+        <w:t>The "Shadow" Feature:</w:t>
+      </w:r>
+      <w:r>
+        <w:t xml:space="preserve"> Ensure the "shadow" isn't just a color, but a gradient. Prompt: </w:t>
+      </w:r>
+      <w:r>
+        <w:rPr>
+          <w:i/>
+          <w:iCs/>
+        </w:rPr>
+        <w:t>"Make the left shadow feature a linear gradient from black to transparent so the bottles in the background subtly peek through behind the scrolling words"</w:t>
+      </w:r>
+      <w:r>
+        <w:t xml:space="preserve">. </w:t>
+      </w:r>
+    </w:p>
+    <w:p>
+      <w:pPr>
+        <w:tabs>
+          <w:tab w:val="left" w:pos="1308"/>
+        </w:tabs>
+        <w:rPr>
+          <w:b/>
+          <w:bCs/>
+        </w:rPr>
+      </w:pPr>
+      <w:r>
+        <w:rPr>
+          <w:b/>
+          <w:bCs/>
+        </w:rPr>
+        <w:t>4. Final Execution Check</w:t>
+      </w:r>
+    </w:p>
+    <w:p>
+      <w:pPr>
+        <w:tabs>
+          <w:tab w:val="left" w:pos="1308"/>
+        </w:tabs>
+      </w:pPr>
+      <w:r>
+        <w:t>Once the code is applied in Antigravity:</w:t>
+      </w:r>
+    </w:p>
+    <w:p>
+      <w:pPr>
+        <w:numPr>
+          <w:ilvl w:val="0"/>
+          <w:numId w:val="33"/>
+        </w:numPr>
+        <w:tabs>
+          <w:tab w:val="left" w:pos="1308"/>
+        </w:tabs>
+      </w:pPr>
+      <w:r>
+        <w:rPr>
+          <w:b/>
+          <w:bCs/>
+        </w:rPr>
+        <w:t>Save &amp; Hot-Reload:</w:t>
+      </w:r>
+      <w:r>
+        <w:t xml:space="preserve"> Check if the words "adjust and stay" as intended. </w:t>
+      </w:r>
+    </w:p>
+    <w:p>
+      <w:pPr>
+        <w:numPr>
+          <w:ilvl w:val="0"/>
+          <w:numId w:val="33"/>
+        </w:numPr>
+        <w:tabs>
+          <w:tab w:val="left" w:pos="1308"/>
+        </w:tabs>
+      </w:pPr>
+      <w:r>
+        <w:rPr>
+          <w:b/>
+          <w:bCs/>
+        </w:rPr>
+        <w:t>Performance Check:</w:t>
+      </w:r>
+      <w:r>
+        <w:t xml:space="preserve"> Ensure the Framer Motion animation isn't dropping frames. Since you're in Antigravity, you can quickly ask Claude to </w:t>
+      </w:r>
+      <w:r>
+        <w:rPr>
+          <w:i/>
+          <w:iCs/>
+        </w:rPr>
+        <w:t xml:space="preserve">"optimize the animation loop to use GPU acceleration (transform: </w:t>
+      </w:r>
+      <w:proofErr w:type="spellStart"/>
+      <w:r>
+        <w:rPr>
+          <w:i/>
+          <w:iCs/>
+        </w:rPr>
+        <w:t>translateZ</w:t>
+      </w:r>
+      <w:proofErr w:type="spellEnd"/>
+      <w:r>
+        <w:rPr>
+          <w:i/>
+          <w:iCs/>
+        </w:rPr>
+        <w:t>(0))"</w:t>
+      </w:r>
+      <w:r>
+        <w:t xml:space="preserve">. </w:t>
+      </w:r>
+    </w:p>
+    <w:p>
+      <w:pPr>
+        <w:tabs>
+          <w:tab w:val="left" w:pos="1308"/>
+        </w:tabs>
+      </w:pPr>
+      <w:r>
+        <w:t xml:space="preserve">This setup turns your "About" section into a high-end cinematic experience that perfectly balances your </w:t>
+      </w:r>
+      <w:r>
+        <w:rPr>
+          <w:b/>
+          <w:bCs/>
+        </w:rPr>
+        <w:t>technical engineering background</w:t>
+      </w:r>
+      <w:r>
+        <w:t xml:space="preserve"> with </w:t>
+      </w:r>
+      <w:r>
+        <w:rPr>
+          <w:b/>
+          <w:bCs/>
+        </w:rPr>
+        <w:t>world-class luxury branding</w:t>
+      </w:r>
+      <w:r>
+        <w:t xml:space="preserve">. </w:t>
+      </w:r>
+    </w:p>
+    <w:p>
+      <w:pPr>
+        <w:tabs>
+          <w:tab w:val="left" w:pos="1308"/>
+        </w:tabs>
+      </w:pPr>
+      <w:r>
+        <w:t xml:space="preserve"> </w:t>
       </w:r>
     </w:p>
     <w:p>
@@ -6493,6 +6858,155 @@
     </w:lvl>
   </w:abstractNum>
   <w:abstractNum w:abstractNumId="15" w15:restartNumberingAfterBreak="0">
+    <w:nsid w:val="36103F32"/>
+    <w:multiLevelType w:val="multilevel"/>
+    <w:tmpl w:val="300A6C96"/>
+    <w:lvl w:ilvl="0">
+      <w:start w:val="1"/>
+      <w:numFmt w:val="bullet"/>
+      <w:lvlText w:val=""/>
+      <w:lvlJc w:val="left"/>
+      <w:pPr>
+        <w:tabs>
+          <w:tab w:val="num" w:pos="720"/>
+        </w:tabs>
+        <w:ind w:left="720" w:hanging="360"/>
+      </w:pPr>
+      <w:rPr>
+        <w:rFonts w:ascii="Symbol" w:hAnsi="Symbol" w:hint="default"/>
+        <w:sz w:val="20"/>
+      </w:rPr>
+    </w:lvl>
+    <w:lvl w:ilvl="1" w:tentative="1">
+      <w:start w:val="1"/>
+      <w:numFmt w:val="bullet"/>
+      <w:lvlText w:val="o"/>
+      <w:lvlJc w:val="left"/>
+      <w:pPr>
+        <w:tabs>
+          <w:tab w:val="num" w:pos="1440"/>
+        </w:tabs>
+        <w:ind w:left="1440" w:hanging="360"/>
+      </w:pPr>
+      <w:rPr>
+        <w:rFonts w:ascii="Courier New" w:hAnsi="Courier New" w:hint="default"/>
+        <w:sz w:val="20"/>
+      </w:rPr>
+    </w:lvl>
+    <w:lvl w:ilvl="2" w:tentative="1">
+      <w:start w:val="1"/>
+      <w:numFmt w:val="bullet"/>
+      <w:lvlText w:val=""/>
+      <w:lvlJc w:val="left"/>
+      <w:pPr>
+        <w:tabs>
+          <w:tab w:val="num" w:pos="2160"/>
+        </w:tabs>
+        <w:ind w:left="2160" w:hanging="360"/>
+      </w:pPr>
+      <w:rPr>
+        <w:rFonts w:ascii="Wingdings" w:hAnsi="Wingdings" w:hint="default"/>
+        <w:sz w:val="20"/>
+      </w:rPr>
+    </w:lvl>
+    <w:lvl w:ilvl="3" w:tentative="1">
+      <w:start w:val="1"/>
+      <w:numFmt w:val="bullet"/>
+      <w:lvlText w:val=""/>
+      <w:lvlJc w:val="left"/>
+      <w:pPr>
+        <w:tabs>
+          <w:tab w:val="num" w:pos="2880"/>
+        </w:tabs>
+        <w:ind w:left="2880" w:hanging="360"/>
+      </w:pPr>
+      <w:rPr>
+        <w:rFonts w:ascii="Wingdings" w:hAnsi="Wingdings" w:hint="default"/>
+        <w:sz w:val="20"/>
+      </w:rPr>
+    </w:lvl>
+    <w:lvl w:ilvl="4" w:tentative="1">
+      <w:start w:val="1"/>
+      <w:numFmt w:val="bullet"/>
+      <w:lvlText w:val=""/>
+      <w:lvlJc w:val="left"/>
+      <w:pPr>
+        <w:tabs>
+          <w:tab w:val="num" w:pos="3600"/>
+        </w:tabs>
+        <w:ind w:left="3600" w:hanging="360"/>
+      </w:pPr>
+      <w:rPr>
+        <w:rFonts w:ascii="Wingdings" w:hAnsi="Wingdings" w:hint="default"/>
+        <w:sz w:val="20"/>
+      </w:rPr>
+    </w:lvl>
+    <w:lvl w:ilvl="5" w:tentative="1">
+      <w:start w:val="1"/>
+      <w:numFmt w:val="bullet"/>
+      <w:lvlText w:val=""/>
+      <w:lvlJc w:val="left"/>
+      <w:pPr>
+        <w:tabs>
+          <w:tab w:val="num" w:pos="4320"/>
+        </w:tabs>
+        <w:ind w:left="4320" w:hanging="360"/>
+      </w:pPr>
+      <w:rPr>
+        <w:rFonts w:ascii="Wingdings" w:hAnsi="Wingdings" w:hint="default"/>
+        <w:sz w:val="20"/>
+      </w:rPr>
+    </w:lvl>
+    <w:lvl w:ilvl="6" w:tentative="1">
+      <w:start w:val="1"/>
+      <w:numFmt w:val="bullet"/>
+      <w:lvlText w:val=""/>
+      <w:lvlJc w:val="left"/>
+      <w:pPr>
+        <w:tabs>
+          <w:tab w:val="num" w:pos="5040"/>
+        </w:tabs>
+        <w:ind w:left="5040" w:hanging="360"/>
+      </w:pPr>
+      <w:rPr>
+        <w:rFonts w:ascii="Wingdings" w:hAnsi="Wingdings" w:hint="default"/>
+        <w:sz w:val="20"/>
+      </w:rPr>
+    </w:lvl>
+    <w:lvl w:ilvl="7" w:tentative="1">
+      <w:start w:val="1"/>
+      <w:numFmt w:val="bullet"/>
+      <w:lvlText w:val=""/>
+      <w:lvlJc w:val="left"/>
+      <w:pPr>
+        <w:tabs>
+          <w:tab w:val="num" w:pos="5760"/>
+        </w:tabs>
+        <w:ind w:left="5760" w:hanging="360"/>
+      </w:pPr>
+      <w:rPr>
+        <w:rFonts w:ascii="Wingdings" w:hAnsi="Wingdings" w:hint="default"/>
+        <w:sz w:val="20"/>
+      </w:rPr>
+    </w:lvl>
+    <w:lvl w:ilvl="8" w:tentative="1">
+      <w:start w:val="1"/>
+      <w:numFmt w:val="bullet"/>
+      <w:lvlText w:val=""/>
+      <w:lvlJc w:val="left"/>
+      <w:pPr>
+        <w:tabs>
+          <w:tab w:val="num" w:pos="6480"/>
+        </w:tabs>
+        <w:ind w:left="6480" w:hanging="360"/>
+      </w:pPr>
+      <w:rPr>
+        <w:rFonts w:ascii="Wingdings" w:hAnsi="Wingdings" w:hint="default"/>
+        <w:sz w:val="20"/>
+      </w:rPr>
+    </w:lvl>
+  </w:abstractNum>
+  <w:abstractNum w:abstractNumId="16" w15:restartNumberingAfterBreak="0">
     <w:nsid w:val="37E20547"/>
     <w:multiLevelType w:val="hybridMultilevel"/>
     <w:tmpl w:val="30D0F544"/>
@@ -6605,7 +7119,7 @@
       </w:rPr>
     </w:lvl>
   </w:abstractNum>
-  <w:abstractNum w:abstractNumId="16" w15:restartNumberingAfterBreak="0">
+  <w:abstractNum w:abstractNumId="17" w15:restartNumberingAfterBreak="0">
     <w:nsid w:val="38FB3FD6"/>
     <w:multiLevelType w:val="hybridMultilevel"/>
     <w:tmpl w:val="49E2EA50"/>
@@ -6718,7 +7232,7 @@
       </w:rPr>
     </w:lvl>
   </w:abstractNum>
-  <w:abstractNum w:abstractNumId="17" w15:restartNumberingAfterBreak="0">
+  <w:abstractNum w:abstractNumId="18" w15:restartNumberingAfterBreak="0">
     <w:nsid w:val="3CD8637C"/>
     <w:multiLevelType w:val="multilevel"/>
     <w:tmpl w:val="A41E917C"/>
@@ -6867,7 +7381,7 @@
       </w:rPr>
     </w:lvl>
   </w:abstractNum>
-  <w:abstractNum w:abstractNumId="18" w15:restartNumberingAfterBreak="0">
+  <w:abstractNum w:abstractNumId="19" w15:restartNumberingAfterBreak="0">
     <w:nsid w:val="4062222D"/>
     <w:multiLevelType w:val="multilevel"/>
     <w:tmpl w:val="7FE85552"/>
@@ -7016,7 +7530,7 @@
       </w:rPr>
     </w:lvl>
   </w:abstractNum>
-  <w:abstractNum w:abstractNumId="19" w15:restartNumberingAfterBreak="0">
+  <w:abstractNum w:abstractNumId="20" w15:restartNumberingAfterBreak="0">
     <w:nsid w:val="43C94794"/>
     <w:multiLevelType w:val="multilevel"/>
     <w:tmpl w:val="600070B6"/>
@@ -7165,7 +7679,7 @@
       </w:rPr>
     </w:lvl>
   </w:abstractNum>
-  <w:abstractNum w:abstractNumId="20" w15:restartNumberingAfterBreak="0">
+  <w:abstractNum w:abstractNumId="21" w15:restartNumberingAfterBreak="0">
     <w:nsid w:val="48FD4FAF"/>
     <w:multiLevelType w:val="hybridMultilevel"/>
     <w:tmpl w:val="7DEA015E"/>
@@ -7254,7 +7768,7 @@
       </w:pPr>
     </w:lvl>
   </w:abstractNum>
-  <w:abstractNum w:abstractNumId="21" w15:restartNumberingAfterBreak="0">
+  <w:abstractNum w:abstractNumId="22" w15:restartNumberingAfterBreak="0">
     <w:nsid w:val="528C1109"/>
     <w:multiLevelType w:val="multilevel"/>
     <w:tmpl w:val="5D94545A"/>
@@ -7403,7 +7917,7 @@
       </w:rPr>
     </w:lvl>
   </w:abstractNum>
-  <w:abstractNum w:abstractNumId="22" w15:restartNumberingAfterBreak="0">
+  <w:abstractNum w:abstractNumId="23" w15:restartNumberingAfterBreak="0">
     <w:nsid w:val="53436CB9"/>
     <w:multiLevelType w:val="multilevel"/>
     <w:tmpl w:val="77627E54"/>
@@ -7552,7 +8066,7 @@
       </w:rPr>
     </w:lvl>
   </w:abstractNum>
-  <w:abstractNum w:abstractNumId="23" w15:restartNumberingAfterBreak="0">
+  <w:abstractNum w:abstractNumId="24" w15:restartNumberingAfterBreak="0">
     <w:nsid w:val="5D931643"/>
     <w:multiLevelType w:val="multilevel"/>
     <w:tmpl w:val="67B022CA"/>
@@ -7701,7 +8215,7 @@
       </w:rPr>
     </w:lvl>
   </w:abstractNum>
-  <w:abstractNum w:abstractNumId="24" w15:restartNumberingAfterBreak="0">
+  <w:abstractNum w:abstractNumId="25" w15:restartNumberingAfterBreak="0">
     <w:nsid w:val="5D9D2A99"/>
     <w:multiLevelType w:val="multilevel"/>
     <w:tmpl w:val="DBE0B1E2"/>
@@ -7850,7 +8364,7 @@
       </w:rPr>
     </w:lvl>
   </w:abstractNum>
-  <w:abstractNum w:abstractNumId="25" w15:restartNumberingAfterBreak="0">
+  <w:abstractNum w:abstractNumId="26" w15:restartNumberingAfterBreak="0">
     <w:nsid w:val="61233890"/>
     <w:multiLevelType w:val="hybridMultilevel"/>
     <w:tmpl w:val="8D1E2280"/>
@@ -7939,7 +8453,7 @@
       </w:pPr>
     </w:lvl>
   </w:abstractNum>
-  <w:abstractNum w:abstractNumId="26" w15:restartNumberingAfterBreak="0">
+  <w:abstractNum w:abstractNumId="27" w15:restartNumberingAfterBreak="0">
     <w:nsid w:val="6DBC0A39"/>
     <w:multiLevelType w:val="multilevel"/>
     <w:tmpl w:val="CCE64B22"/>
@@ -8088,7 +8602,156 @@
       </w:rPr>
     </w:lvl>
   </w:abstractNum>
-  <w:abstractNum w:abstractNumId="27" w15:restartNumberingAfterBreak="0">
+  <w:abstractNum w:abstractNumId="28" w15:restartNumberingAfterBreak="0">
+    <w:nsid w:val="7146681F"/>
+    <w:multiLevelType w:val="multilevel"/>
+    <w:tmpl w:val="6BAC41FE"/>
+    <w:lvl w:ilvl="0">
+      <w:start w:val="1"/>
+      <w:numFmt w:val="bullet"/>
+      <w:lvlText w:val=""/>
+      <w:lvlJc w:val="left"/>
+      <w:pPr>
+        <w:tabs>
+          <w:tab w:val="num" w:pos="720"/>
+        </w:tabs>
+        <w:ind w:left="720" w:hanging="360"/>
+      </w:pPr>
+      <w:rPr>
+        <w:rFonts w:ascii="Symbol" w:hAnsi="Symbol" w:hint="default"/>
+        <w:sz w:val="20"/>
+      </w:rPr>
+    </w:lvl>
+    <w:lvl w:ilvl="1" w:tentative="1">
+      <w:start w:val="1"/>
+      <w:numFmt w:val="bullet"/>
+      <w:lvlText w:val="o"/>
+      <w:lvlJc w:val="left"/>
+      <w:pPr>
+        <w:tabs>
+          <w:tab w:val="num" w:pos="1440"/>
+        </w:tabs>
+        <w:ind w:left="1440" w:hanging="360"/>
+      </w:pPr>
+      <w:rPr>
+        <w:rFonts w:ascii="Courier New" w:hAnsi="Courier New" w:hint="default"/>
+        <w:sz w:val="20"/>
+      </w:rPr>
+    </w:lvl>
+    <w:lvl w:ilvl="2" w:tentative="1">
+      <w:start w:val="1"/>
+      <w:numFmt w:val="bullet"/>
+      <w:lvlText w:val=""/>
+      <w:lvlJc w:val="left"/>
+      <w:pPr>
+        <w:tabs>
+          <w:tab w:val="num" w:pos="2160"/>
+        </w:tabs>
+        <w:ind w:left="2160" w:hanging="360"/>
+      </w:pPr>
+      <w:rPr>
+        <w:rFonts w:ascii="Wingdings" w:hAnsi="Wingdings" w:hint="default"/>
+        <w:sz w:val="20"/>
+      </w:rPr>
+    </w:lvl>
+    <w:lvl w:ilvl="3" w:tentative="1">
+      <w:start w:val="1"/>
+      <w:numFmt w:val="bullet"/>
+      <w:lvlText w:val=""/>
+      <w:lvlJc w:val="left"/>
+      <w:pPr>
+        <w:tabs>
+          <w:tab w:val="num" w:pos="2880"/>
+        </w:tabs>
+        <w:ind w:left="2880" w:hanging="360"/>
+      </w:pPr>
+      <w:rPr>
+        <w:rFonts w:ascii="Wingdings" w:hAnsi="Wingdings" w:hint="default"/>
+        <w:sz w:val="20"/>
+      </w:rPr>
+    </w:lvl>
+    <w:lvl w:ilvl="4" w:tentative="1">
+      <w:start w:val="1"/>
+      <w:numFmt w:val="bullet"/>
+      <w:lvlText w:val=""/>
+      <w:lvlJc w:val="left"/>
+      <w:pPr>
+        <w:tabs>
+          <w:tab w:val="num" w:pos="3600"/>
+        </w:tabs>
+        <w:ind w:left="3600" w:hanging="360"/>
+      </w:pPr>
+      <w:rPr>
+        <w:rFonts w:ascii="Wingdings" w:hAnsi="Wingdings" w:hint="default"/>
+        <w:sz w:val="20"/>
+      </w:rPr>
+    </w:lvl>
+    <w:lvl w:ilvl="5" w:tentative="1">
+      <w:start w:val="1"/>
+      <w:numFmt w:val="bullet"/>
+      <w:lvlText w:val=""/>
+      <w:lvlJc w:val="left"/>
+      <w:pPr>
+        <w:tabs>
+          <w:tab w:val="num" w:pos="4320"/>
+        </w:tabs>
+        <w:ind w:left="4320" w:hanging="360"/>
+      </w:pPr>
+      <w:rPr>
+        <w:rFonts w:ascii="Wingdings" w:hAnsi="Wingdings" w:hint="default"/>
+        <w:sz w:val="20"/>
+      </w:rPr>
+    </w:lvl>
+    <w:lvl w:ilvl="6" w:tentative="1">
+      <w:start w:val="1"/>
+      <w:numFmt w:val="bullet"/>
+      <w:lvlText w:val=""/>
+      <w:lvlJc w:val="left"/>
+      <w:pPr>
+        <w:tabs>
+          <w:tab w:val="num" w:pos="5040"/>
+        </w:tabs>
+        <w:ind w:left="5040" w:hanging="360"/>
+      </w:pPr>
+      <w:rPr>
+        <w:rFonts w:ascii="Wingdings" w:hAnsi="Wingdings" w:hint="default"/>
+        <w:sz w:val="20"/>
+      </w:rPr>
+    </w:lvl>
+    <w:lvl w:ilvl="7" w:tentative="1">
+      <w:start w:val="1"/>
+      <w:numFmt w:val="bullet"/>
+      <w:lvlText w:val=""/>
+      <w:lvlJc w:val="left"/>
+      <w:pPr>
+        <w:tabs>
+          <w:tab w:val="num" w:pos="5760"/>
+        </w:tabs>
+        <w:ind w:left="5760" w:hanging="360"/>
+      </w:pPr>
+      <w:rPr>
+        <w:rFonts w:ascii="Wingdings" w:hAnsi="Wingdings" w:hint="default"/>
+        <w:sz w:val="20"/>
+      </w:rPr>
+    </w:lvl>
+    <w:lvl w:ilvl="8" w:tentative="1">
+      <w:start w:val="1"/>
+      <w:numFmt w:val="bullet"/>
+      <w:lvlText w:val=""/>
+      <w:lvlJc w:val="left"/>
+      <w:pPr>
+        <w:tabs>
+          <w:tab w:val="num" w:pos="6480"/>
+        </w:tabs>
+        <w:ind w:left="6480" w:hanging="360"/>
+      </w:pPr>
+      <w:rPr>
+        <w:rFonts w:ascii="Wingdings" w:hAnsi="Wingdings" w:hint="default"/>
+        <w:sz w:val="20"/>
+      </w:rPr>
+    </w:lvl>
+  </w:abstractNum>
+  <w:abstractNum w:abstractNumId="29" w15:restartNumberingAfterBreak="0">
     <w:nsid w:val="7266762C"/>
     <w:multiLevelType w:val="multilevel"/>
     <w:tmpl w:val="8FE005F2"/>
@@ -8237,7 +8900,120 @@
       </w:rPr>
     </w:lvl>
   </w:abstractNum>
-  <w:abstractNum w:abstractNumId="28" w15:restartNumberingAfterBreak="0">
+  <w:abstractNum w:abstractNumId="30" w15:restartNumberingAfterBreak="0">
+    <w:nsid w:val="74692091"/>
+    <w:multiLevelType w:val="multilevel"/>
+    <w:tmpl w:val="4AF04842"/>
+    <w:lvl w:ilvl="0">
+      <w:start w:val="1"/>
+      <w:numFmt w:val="decimal"/>
+      <w:lvlText w:val="%1."/>
+      <w:lvlJc w:val="left"/>
+      <w:pPr>
+        <w:tabs>
+          <w:tab w:val="num" w:pos="720"/>
+        </w:tabs>
+        <w:ind w:left="720" w:hanging="360"/>
+      </w:pPr>
+    </w:lvl>
+    <w:lvl w:ilvl="1" w:tentative="1">
+      <w:start w:val="1"/>
+      <w:numFmt w:val="decimal"/>
+      <w:lvlText w:val="%2."/>
+      <w:lvlJc w:val="left"/>
+      <w:pPr>
+        <w:tabs>
+          <w:tab w:val="num" w:pos="1440"/>
+        </w:tabs>
+        <w:ind w:left="1440" w:hanging="360"/>
+      </w:pPr>
+    </w:lvl>
+    <w:lvl w:ilvl="2" w:tentative="1">
+      <w:start w:val="1"/>
+      <w:numFmt w:val="decimal"/>
+      <w:lvlText w:val="%3."/>
+      <w:lvlJc w:val="left"/>
+      <w:pPr>
+        <w:tabs>
+          <w:tab w:val="num" w:pos="2160"/>
+        </w:tabs>
+        <w:ind w:left="2160" w:hanging="360"/>
+      </w:pPr>
+    </w:lvl>
+    <w:lvl w:ilvl="3" w:tentative="1">
+      <w:start w:val="1"/>
+      <w:numFmt w:val="decimal"/>
+      <w:lvlText w:val="%4."/>
+      <w:lvlJc w:val="left"/>
+      <w:pPr>
+        <w:tabs>
+          <w:tab w:val="num" w:pos="2880"/>
+        </w:tabs>
+        <w:ind w:left="2880" w:hanging="360"/>
+      </w:pPr>
+    </w:lvl>
+    <w:lvl w:ilvl="4" w:tentative="1">
+      <w:start w:val="1"/>
+      <w:numFmt w:val="decimal"/>
+      <w:lvlText w:val="%5."/>
+      <w:lvlJc w:val="left"/>
+      <w:pPr>
+        <w:tabs>
+          <w:tab w:val="num" w:pos="3600"/>
+        </w:tabs>
+        <w:ind w:left="3600" w:hanging="360"/>
+      </w:pPr>
+    </w:lvl>
+    <w:lvl w:ilvl="5" w:tentative="1">
+      <w:start w:val="1"/>
+      <w:numFmt w:val="decimal"/>
+      <w:lvlText w:val="%6."/>
+      <w:lvlJc w:val="left"/>
+      <w:pPr>
+        <w:tabs>
+          <w:tab w:val="num" w:pos="4320"/>
+        </w:tabs>
+        <w:ind w:left="4320" w:hanging="360"/>
+      </w:pPr>
+    </w:lvl>
+    <w:lvl w:ilvl="6" w:tentative="1">
+      <w:start w:val="1"/>
+      <w:numFmt w:val="decimal"/>
+      <w:lvlText w:val="%7."/>
+      <w:lvlJc w:val="left"/>
+      <w:pPr>
+        <w:tabs>
+          <w:tab w:val="num" w:pos="5040"/>
+        </w:tabs>
+        <w:ind w:left="5040" w:hanging="360"/>
+      </w:pPr>
+    </w:lvl>
+    <w:lvl w:ilvl="7" w:tentative="1">
+      <w:start w:val="1"/>
+      <w:numFmt w:val="decimal"/>
+      <w:lvlText w:val="%8."/>
+      <w:lvlJc w:val="left"/>
+      <w:pPr>
+        <w:tabs>
+          <w:tab w:val="num" w:pos="5760"/>
+        </w:tabs>
+        <w:ind w:left="5760" w:hanging="360"/>
+      </w:pPr>
+    </w:lvl>
+    <w:lvl w:ilvl="8" w:tentative="1">
+      <w:start w:val="1"/>
+      <w:numFmt w:val="decimal"/>
+      <w:lvlText w:val="%9."/>
+      <w:lvlJc w:val="left"/>
+      <w:pPr>
+        <w:tabs>
+          <w:tab w:val="num" w:pos="6480"/>
+        </w:tabs>
+        <w:ind w:left="6480" w:hanging="360"/>
+      </w:pPr>
+    </w:lvl>
+  </w:abstractNum>
+  <w:abstractNum w:abstractNumId="31" w15:restartNumberingAfterBreak="0">
     <w:nsid w:val="76904CEC"/>
     <w:multiLevelType w:val="multilevel"/>
     <w:tmpl w:val="723E3BD4"/>
@@ -8386,7 +9162,7 @@
       </w:rPr>
     </w:lvl>
   </w:abstractNum>
-  <w:abstractNum w:abstractNumId="29" w15:restartNumberingAfterBreak="0">
+  <w:abstractNum w:abstractNumId="32" w15:restartNumberingAfterBreak="0">
     <w:nsid w:val="7C4715C1"/>
     <w:multiLevelType w:val="multilevel"/>
     <w:tmpl w:val="5FA241AC"/>
@@ -8536,10 +9312,10 @@
     </w:lvl>
   </w:abstractNum>
   <w:num w:numId="1" w16cid:durableId="2011791356">
-    <w:abstractNumId w:val="25"/>
+    <w:abstractNumId w:val="26"/>
   </w:num>
   <w:num w:numId="2" w16cid:durableId="1075473466">
-    <w:abstractNumId w:val="15"/>
+    <w:abstractNumId w:val="16"/>
   </w:num>
   <w:num w:numId="3" w16cid:durableId="1697540136">
     <w:abstractNumId w:val="1"/>
@@ -8548,13 +9324,13 @@
     <w:abstractNumId w:val="12"/>
   </w:num>
   <w:num w:numId="5" w16cid:durableId="1098401994">
-    <w:abstractNumId w:val="16"/>
+    <w:abstractNumId w:val="17"/>
   </w:num>
   <w:num w:numId="6" w16cid:durableId="1225289953">
     <w:abstractNumId w:val="13"/>
   </w:num>
   <w:num w:numId="7" w16cid:durableId="734855536">
-    <w:abstractNumId w:val="20"/>
+    <w:abstractNumId w:val="21"/>
   </w:num>
   <w:num w:numId="8" w16cid:durableId="1614022759">
     <w:abstractNumId w:val="2"/>
@@ -8563,25 +9339,25 @@
     <w:abstractNumId w:val="3"/>
   </w:num>
   <w:num w:numId="10" w16cid:durableId="1551958189">
-    <w:abstractNumId w:val="29"/>
+    <w:abstractNumId w:val="32"/>
   </w:num>
   <w:num w:numId="11" w16cid:durableId="1811748363">
     <w:abstractNumId w:val="6"/>
   </w:num>
   <w:num w:numId="12" w16cid:durableId="1818759551">
-    <w:abstractNumId w:val="22"/>
+    <w:abstractNumId w:val="23"/>
   </w:num>
   <w:num w:numId="13" w16cid:durableId="1543712332">
-    <w:abstractNumId w:val="26"/>
+    <w:abstractNumId w:val="27"/>
   </w:num>
   <w:num w:numId="14" w16cid:durableId="1626811272">
-    <w:abstractNumId w:val="24"/>
+    <w:abstractNumId w:val="25"/>
   </w:num>
   <w:num w:numId="15" w16cid:durableId="1026250672">
-    <w:abstractNumId w:val="19"/>
+    <w:abstractNumId w:val="20"/>
   </w:num>
   <w:num w:numId="16" w16cid:durableId="1298956039">
-    <w:abstractNumId w:val="18"/>
+    <w:abstractNumId w:val="19"/>
   </w:num>
   <w:num w:numId="17" w16cid:durableId="2045904172">
     <w:abstractNumId w:val="9"/>
@@ -8605,7 +9381,7 @@
     <w:abstractNumId w:val="8"/>
   </w:num>
   <w:num w:numId="24" w16cid:durableId="1422796469">
-    <w:abstractNumId w:val="28"/>
+    <w:abstractNumId w:val="31"/>
   </w:num>
   <w:num w:numId="25" w16cid:durableId="1937249939">
     <w:abstractNumId w:val="10"/>
@@ -8614,16 +9390,25 @@
     <w:abstractNumId w:val="14"/>
   </w:num>
   <w:num w:numId="27" w16cid:durableId="1642227246">
-    <w:abstractNumId w:val="17"/>
+    <w:abstractNumId w:val="18"/>
   </w:num>
   <w:num w:numId="28" w16cid:durableId="1259437990">
-    <w:abstractNumId w:val="21"/>
+    <w:abstractNumId w:val="22"/>
   </w:num>
   <w:num w:numId="29" w16cid:durableId="2007242986">
-    <w:abstractNumId w:val="23"/>
+    <w:abstractNumId w:val="24"/>
   </w:num>
   <w:num w:numId="30" w16cid:durableId="984041648">
-    <w:abstractNumId w:val="27"/>
+    <w:abstractNumId w:val="29"/>
+  </w:num>
+  <w:num w:numId="31" w16cid:durableId="2106681645">
+    <w:abstractNumId w:val="28"/>
+  </w:num>
+  <w:num w:numId="32" w16cid:durableId="567155823">
+    <w:abstractNumId w:val="15"/>
+  </w:num>
+  <w:num w:numId="33" w16cid:durableId="1337151069">
+    <w:abstractNumId w:val="30"/>
   </w:num>
 </w:numbering>
 </file>

</xml_diff>